<commit_message>
Add GUI presets; vectorize ABM; add results
Refactor GUI and core model for usability and performance: abm_gui.m gains scenario preset buttons, a scenario banner, improved layout, slider readouts that mark "Custom (modified)", and helper routines (set_scenario, on_slider, setval). The GUI now auto-runs a loaded scenario and shows richer status text.

Significant performance work in opinion_dynamics_abm.m: replaced the per-agent loop with fully vectorised matrix operations (peer averaging, random peer selection, expert correction, influencer persuasion), added comments about performance, and kept identical update semantics with noise and clamping. This yields much faster runs in Octave.

Documentation and assets updated: octave_source/README.txt updated with performance and GUI usage notes; report PDF/DOCX and several figures refreshed. Added simulation_results/ with analysis_report.txt and result figures (sensitivity, stability, statistics, tornado) documenting experiments and outputs.
</commit_message>
<xml_diff>
--- a/STTHK2133_Assignment3_Report.docx
+++ b/STTHK2133_Assignment3_Report.docx
@@ -2034,6 +2034,1343 @@
         <w:t>The ABM shows that public opinion on AI learning assistants is highly sensitive to the balance of social forces. A balanced baseline converges to a stable, near-neutral consensus; strong influencers drive polarization; strong, trusted experts restore a moderate consensus; and low trust causes fragmentation and instability. The key policy lever for the Ministry of Education is to build and use trusted, well-connected experts — supported by adequate public trust — to counter influencer-driven polarization and misinformation and to steer society toward an informed, stable acceptance of the technology.</w:t>
       </w:r>
     </w:p>
+    <w:p>
+      <w:r>
+        <w:br w:type="page"/>
+      </w:r>
+    </w:p>
+    <w:p>
+      <w:pPr>
+        <w:pStyle w:val="Heading1"/>
+      </w:pPr>
+      <w:r>
+        <w:rPr>
+          <w:color w:val="1F3A5F"/>
+        </w:rPr>
+        <w:t>PART THREE — Stability, Sensitivity &amp; Statistical Analysis</w:t>
+      </w:r>
+    </w:p>
+    <w:p>
+      <w:pPr>
+        <w:spacing w:after="120"/>
+      </w:pPr>
+      <w:r>
+        <w:rPr>
+          <w:b w:val="0"/>
+          <w:i/>
+          <w:sz w:val="22"/>
+        </w:rPr>
+        <w:t>This section quantitatively verifies the model. All experiments reuse the same simulation engine; statistical results use 40 independent random seeds per scenario, with assumption-free permutation tests and bootstrap confidence intervals.</w:t>
+      </w:r>
+    </w:p>
+    <w:p>
+      <w:pPr>
+        <w:pStyle w:val="Heading2"/>
+      </w:pPr>
+      <w:r>
+        <w:rPr>
+          <w:color w:val="1F3A5F"/>
+        </w:rPr>
+        <w:t>3.1 Stability Analysis</w:t>
+      </w:r>
+    </w:p>
+    <w:p>
+      <w:pPr>
+        <w:spacing w:after="120"/>
+      </w:pPr>
+      <w:r>
+        <w:rPr>
+          <w:b w:val="0"/>
+          <w:i w:val="0"/>
+          <w:sz w:val="22"/>
+        </w:rPr>
+        <w:t>Two aspects of stability were examined: (a) temporal settling — how quickly the step-to-step change in opinions decays; and (b) sensitive dependence on initial conditions — how far the final state moves when a single citizen’s initial opinion is perturbed by +0.05.</w:t>
+      </w:r>
+    </w:p>
+    <w:p>
+      <w:pPr>
+        <w:pStyle w:val="ListBullet"/>
+      </w:pPr>
+      <w:r>
+        <w:rPr>
+          <w:b/>
+        </w:rPr>
+        <w:t xml:space="preserve">Temporal settling: </w:t>
+      </w:r>
+      <w:r>
+        <w:t>the population-average opinion stabilises early in every scenario, but the mean per-agent change never drops below 1e-3 because of the small stochastic noise term (σ) — i.e. the macro state is stable while micro-fluctuations persist. This is the expected behaviour of a noisy social system.</w:t>
+      </w:r>
+    </w:p>
+    <w:p>
+      <w:pPr>
+        <w:pStyle w:val="ListBullet"/>
+      </w:pPr>
+      <w:r>
+        <w:rPr>
+          <w:b/>
+        </w:rPr>
+        <w:t>Sensitive dependence (final-state L2 divergence after a 0.05 perturbation):</w:t>
+      </w:r>
+    </w:p>
+    <w:tbl>
+      <w:tblPr>
+        <w:tblStyle w:val="LightGrid-Accent1"/>
+        <w:tblW w:type="auto" w:w="0"/>
+        <w:tblLook w:firstColumn="1" w:firstRow="1" w:lastColumn="0" w:lastRow="0" w:noHBand="0" w:noVBand="1" w:val="04A0"/>
+      </w:tblPr>
+      <w:tblGrid>
+        <w:gridCol w:w="2880"/>
+        <w:gridCol w:w="2880"/>
+        <w:gridCol w:w="2880"/>
+      </w:tblGrid>
+      <w:tr>
+        <w:tc>
+          <w:tcPr>
+            <w:tcW w:type="dxa" w:w="2880"/>
+          </w:tcPr>
+          <w:p>
+            <w:r/>
+            <w:r>
+              <w:rPr>
+                <w:b/>
+                <w:sz w:val="18"/>
+              </w:rPr>
+              <w:t>Scenario</w:t>
+            </w:r>
+          </w:p>
+        </w:tc>
+        <w:tc>
+          <w:tcPr>
+            <w:tcW w:type="dxa" w:w="2880"/>
+          </w:tcPr>
+          <w:p>
+            <w:r/>
+            <w:r>
+              <w:rPr>
+                <w:b/>
+                <w:sz w:val="18"/>
+              </w:rPr>
+              <w:t>Divergence (mean ± sd)</w:t>
+            </w:r>
+          </w:p>
+        </w:tc>
+        <w:tc>
+          <w:tcPr>
+            <w:tcW w:type="dxa" w:w="2880"/>
+          </w:tcPr>
+          <w:p>
+            <w:r/>
+            <w:r>
+              <w:rPr>
+                <w:b/>
+                <w:sz w:val="18"/>
+              </w:rPr>
+              <w:t>Stability reading</w:t>
+            </w:r>
+          </w:p>
+        </w:tc>
+      </w:tr>
+      <w:tr>
+        <w:tc>
+          <w:tcPr>
+            <w:tcW w:type="dxa" w:w="2880"/>
+          </w:tcPr>
+          <w:p>
+            <w:r/>
+            <w:r>
+              <w:rPr>
+                <w:sz w:val="18"/>
+              </w:rPr>
+              <w:t>S1 Baseline</w:t>
+            </w:r>
+          </w:p>
+        </w:tc>
+        <w:tc>
+          <w:tcPr>
+            <w:tcW w:type="dxa" w:w="2880"/>
+          </w:tcPr>
+          <w:p>
+            <w:r/>
+            <w:r>
+              <w:rPr>
+                <w:sz w:val="18"/>
+              </w:rPr>
+              <w:t>0.087 ± 0.152</w:t>
+            </w:r>
+          </w:p>
+        </w:tc>
+        <w:tc>
+          <w:tcPr>
+            <w:tcW w:type="dxa" w:w="2880"/>
+          </w:tcPr>
+          <w:p>
+            <w:r/>
+            <w:r>
+              <w:rPr>
+                <w:sz w:val="18"/>
+              </w:rPr>
+              <w:t>Stable / robust</w:t>
+            </w:r>
+          </w:p>
+        </w:tc>
+      </w:tr>
+      <w:tr>
+        <w:tc>
+          <w:tcPr>
+            <w:tcW w:type="dxa" w:w="2880"/>
+          </w:tcPr>
+          <w:p>
+            <w:r/>
+            <w:r>
+              <w:rPr>
+                <w:sz w:val="18"/>
+              </w:rPr>
+              <w:t>S2 Strong Influencer</w:t>
+            </w:r>
+          </w:p>
+        </w:tc>
+        <w:tc>
+          <w:tcPr>
+            <w:tcW w:type="dxa" w:w="2880"/>
+          </w:tcPr>
+          <w:p>
+            <w:r/>
+            <w:r>
+              <w:rPr>
+                <w:sz w:val="18"/>
+              </w:rPr>
+              <w:t>0.514 ± 0.661</w:t>
+            </w:r>
+          </w:p>
+        </w:tc>
+        <w:tc>
+          <w:tcPr>
+            <w:tcW w:type="dxa" w:w="2880"/>
+          </w:tcPr>
+          <w:p>
+            <w:r/>
+            <w:r>
+              <w:rPr>
+                <w:sz w:val="18"/>
+              </w:rPr>
+              <w:t>Amplifying (which camp wins can flip)</w:t>
+            </w:r>
+          </w:p>
+        </w:tc>
+      </w:tr>
+      <w:tr>
+        <w:tc>
+          <w:tcPr>
+            <w:tcW w:type="dxa" w:w="2880"/>
+          </w:tcPr>
+          <w:p>
+            <w:r/>
+            <w:r>
+              <w:rPr>
+                <w:sz w:val="18"/>
+              </w:rPr>
+              <w:t>S3 Strong Expert</w:t>
+            </w:r>
+          </w:p>
+        </w:tc>
+        <w:tc>
+          <w:tcPr>
+            <w:tcW w:type="dxa" w:w="2880"/>
+          </w:tcPr>
+          <w:p>
+            <w:r/>
+            <w:r>
+              <w:rPr>
+                <w:sz w:val="18"/>
+              </w:rPr>
+              <w:t>0.107 ± 0.321</w:t>
+            </w:r>
+          </w:p>
+        </w:tc>
+        <w:tc>
+          <w:tcPr>
+            <w:tcW w:type="dxa" w:w="2880"/>
+          </w:tcPr>
+          <w:p>
+            <w:r/>
+            <w:r>
+              <w:rPr>
+                <w:sz w:val="18"/>
+              </w:rPr>
+              <w:t>Stable / robust</w:t>
+            </w:r>
+          </w:p>
+        </w:tc>
+      </w:tr>
+      <w:tr>
+        <w:tc>
+          <w:tcPr>
+            <w:tcW w:type="dxa" w:w="2880"/>
+          </w:tcPr>
+          <w:p>
+            <w:r/>
+            <w:r>
+              <w:rPr>
+                <w:sz w:val="18"/>
+              </w:rPr>
+              <w:t>S4 Low Trust</w:t>
+            </w:r>
+          </w:p>
+        </w:tc>
+        <w:tc>
+          <w:tcPr>
+            <w:tcW w:type="dxa" w:w="2880"/>
+          </w:tcPr>
+          <w:p>
+            <w:r/>
+            <w:r>
+              <w:rPr>
+                <w:sz w:val="18"/>
+              </w:rPr>
+              <w:t>2.284 ± 0.783</w:t>
+            </w:r>
+          </w:p>
+        </w:tc>
+        <w:tc>
+          <w:tcPr>
+            <w:tcW w:type="dxa" w:w="2880"/>
+          </w:tcPr>
+          <w:p>
+            <w:r/>
+            <w:r>
+              <w:rPr>
+                <w:sz w:val="18"/>
+              </w:rPr>
+              <w:t>Highly sensitive (echo chambers diverge)</w:t>
+            </w:r>
+          </w:p>
+        </w:tc>
+      </w:tr>
+    </w:tbl>
+    <w:p/>
+    <w:p>
+      <w:pPr>
+        <w:spacing w:after="120"/>
+      </w:pPr>
+      <w:r>
+        <w:rPr>
+          <w:b w:val="0"/>
+          <w:i w:val="0"/>
+          <w:sz w:val="22"/>
+        </w:rPr>
+        <w:t>Interpretation: expert correction (S3) and the baseline (S1) are dynamically stable — a tiny nudge is absorbed. Polarization (S2) and especially low-trust fragmentation (S4) are sensitive: because agents only listen to like-minded sources, a small initial difference can decide which echo chamber an agent joins, so final states diverge strongly. This is the hallmark of a nonlinear, path-dependent system.</w:t>
+      </w:r>
+    </w:p>
+    <w:p>
+      <w:pPr>
+        <w:jc w:val="center"/>
+      </w:pPr>
+      <w:r>
+        <w:drawing>
+          <wp:inline xmlns:a="http://schemas.openxmlformats.org/drawingml/2006/main" xmlns:pic="http://schemas.openxmlformats.org/drawingml/2006/picture">
+            <wp:extent cx="5669280" cy="2180492"/>
+            <wp:docPr id="6" name="Picture 6"/>
+            <wp:cNvGraphicFramePr>
+              <a:graphicFrameLocks noChangeAspect="1"/>
+            </wp:cNvGraphicFramePr>
+            <a:graphic>
+              <a:graphicData uri="http://schemas.openxmlformats.org/drawingml/2006/picture">
+                <pic:pic>
+                  <pic:nvPicPr>
+                    <pic:cNvPr id="0" name="fig_stability.png"/>
+                    <pic:cNvPicPr/>
+                  </pic:nvPicPr>
+                  <pic:blipFill>
+                    <a:blip r:embed="rId14"/>
+                    <a:stretch>
+                      <a:fillRect/>
+                    </a:stretch>
+                  </pic:blipFill>
+                  <pic:spPr>
+                    <a:xfrm>
+                      <a:off x="0" y="0"/>
+                      <a:ext cx="5669280" cy="2180492"/>
+                    </a:xfrm>
+                    <a:prstGeom prst="rect"/>
+                  </pic:spPr>
+                </pic:pic>
+              </a:graphicData>
+            </a:graphic>
+          </wp:inline>
+        </w:drawing>
+      </w:r>
+    </w:p>
+    <w:p>
+      <w:pPr>
+        <w:spacing w:after="200"/>
+        <w:jc w:val="center"/>
+      </w:pPr>
+      <w:r>
+        <w:rPr>
+          <w:i/>
+          <w:sz w:val="18"/>
+        </w:rPr>
+        <w:t>Figure A — Left: convergence of mean |opinion change| per step (log scale). Right: sensitive dependence on initial conditions by scenario.</w:t>
+      </w:r>
+    </w:p>
+    <w:p>
+      <w:pPr>
+        <w:pStyle w:val="Heading2"/>
+      </w:pPr>
+      <w:r>
+        <w:rPr>
+          <w:color w:val="1F3A5F"/>
+        </w:rPr>
+        <w:t>3.2 Sensitivity Analysis (One-At-A-Time)</w:t>
+      </w:r>
+    </w:p>
+    <w:p>
+      <w:pPr>
+        <w:spacing w:after="120"/>
+      </w:pPr>
+      <w:r>
+        <w:rPr>
+          <w:b w:val="0"/>
+          <w:i w:val="0"/>
+          <w:sz w:val="22"/>
+        </w:rPr>
+        <w:t>Each parameter was swept across its range (other parameters held at baseline), and the effect on the final opinion spread (standard deviation) was measured, averaged over 8 seeds. The sensitivity index is the range (max−min) of the output produced by each parameter.</w:t>
+      </w:r>
+    </w:p>
+    <w:tbl>
+      <w:tblPr>
+        <w:tblStyle w:val="LightGrid-Accent1"/>
+        <w:tblW w:type="auto" w:w="0"/>
+        <w:tblLook w:firstColumn="1" w:firstRow="1" w:lastColumn="0" w:lastRow="0" w:noHBand="0" w:noVBand="1" w:val="04A0"/>
+      </w:tblPr>
+      <w:tblGrid>
+        <w:gridCol w:w="2880"/>
+        <w:gridCol w:w="2880"/>
+        <w:gridCol w:w="2880"/>
+      </w:tblGrid>
+      <w:tr>
+        <w:tc>
+          <w:tcPr>
+            <w:tcW w:type="dxa" w:w="2880"/>
+          </w:tcPr>
+          <w:p>
+            <w:r/>
+            <w:r>
+              <w:rPr>
+                <w:b/>
+                <w:sz w:val="18"/>
+              </w:rPr>
+              <w:t>Parameter</w:t>
+            </w:r>
+          </w:p>
+        </w:tc>
+        <w:tc>
+          <w:tcPr>
+            <w:tcW w:type="dxa" w:w="2880"/>
+          </w:tcPr>
+          <w:p>
+            <w:r/>
+            <w:r>
+              <w:rPr>
+                <w:b/>
+                <w:sz w:val="18"/>
+              </w:rPr>
+              <w:t>Sensitivity index</w:t>
+            </w:r>
+          </w:p>
+        </w:tc>
+        <w:tc>
+          <w:tcPr>
+            <w:tcW w:type="dxa" w:w="2880"/>
+          </w:tcPr>
+          <w:p>
+            <w:r/>
+            <w:r>
+              <w:rPr>
+                <w:b/>
+                <w:sz w:val="18"/>
+              </w:rPr>
+              <w:t>Rank</w:t>
+            </w:r>
+          </w:p>
+        </w:tc>
+      </w:tr>
+      <w:tr>
+        <w:tc>
+          <w:tcPr>
+            <w:tcW w:type="dxa" w:w="2880"/>
+          </w:tcPr>
+          <w:p>
+            <w:r/>
+            <w:r>
+              <w:rPr>
+                <w:sz w:val="18"/>
+              </w:rPr>
+              <w:t>Expert pull (γ)</w:t>
+            </w:r>
+          </w:p>
+        </w:tc>
+        <w:tc>
+          <w:tcPr>
+            <w:tcW w:type="dxa" w:w="2880"/>
+          </w:tcPr>
+          <w:p>
+            <w:r/>
+            <w:r>
+              <w:rPr>
+                <w:sz w:val="18"/>
+              </w:rPr>
+              <w:t>0.737</w:t>
+            </w:r>
+          </w:p>
+        </w:tc>
+        <w:tc>
+          <w:tcPr>
+            <w:tcW w:type="dxa" w:w="2880"/>
+          </w:tcPr>
+          <w:p>
+            <w:r/>
+            <w:r>
+              <w:rPr>
+                <w:sz w:val="18"/>
+              </w:rPr>
+              <w:t>1 (most influential)</w:t>
+            </w:r>
+          </w:p>
+        </w:tc>
+      </w:tr>
+      <w:tr>
+        <w:tc>
+          <w:tcPr>
+            <w:tcW w:type="dxa" w:w="2880"/>
+          </w:tcPr>
+          <w:p>
+            <w:r/>
+            <w:r>
+              <w:rPr>
+                <w:sz w:val="18"/>
+              </w:rPr>
+              <w:t>Influencer pull (δ)</w:t>
+            </w:r>
+          </w:p>
+        </w:tc>
+        <w:tc>
+          <w:tcPr>
+            <w:tcW w:type="dxa" w:w="2880"/>
+          </w:tcPr>
+          <w:p>
+            <w:r/>
+            <w:r>
+              <w:rPr>
+                <w:sz w:val="18"/>
+              </w:rPr>
+              <w:t>0.566</w:t>
+            </w:r>
+          </w:p>
+        </w:tc>
+        <w:tc>
+          <w:tcPr>
+            <w:tcW w:type="dxa" w:w="2880"/>
+          </w:tcPr>
+          <w:p>
+            <w:r/>
+            <w:r>
+              <w:rPr>
+                <w:sz w:val="18"/>
+              </w:rPr>
+              <w:t>2</w:t>
+            </w:r>
+          </w:p>
+        </w:tc>
+      </w:tr>
+      <w:tr>
+        <w:tc>
+          <w:tcPr>
+            <w:tcW w:type="dxa" w:w="2880"/>
+          </w:tcPr>
+          <w:p>
+            <w:r/>
+            <w:r>
+              <w:rPr>
+                <w:sz w:val="18"/>
+              </w:rPr>
+              <w:t>Averaging (β)</w:t>
+            </w:r>
+          </w:p>
+        </w:tc>
+        <w:tc>
+          <w:tcPr>
+            <w:tcW w:type="dxa" w:w="2880"/>
+          </w:tcPr>
+          <w:p>
+            <w:r/>
+            <w:r>
+              <w:rPr>
+                <w:sz w:val="18"/>
+              </w:rPr>
+              <w:t>0.215</w:t>
+            </w:r>
+          </w:p>
+        </w:tc>
+        <w:tc>
+          <w:tcPr>
+            <w:tcW w:type="dxa" w:w="2880"/>
+          </w:tcPr>
+          <w:p>
+            <w:r/>
+            <w:r>
+              <w:rPr>
+                <w:sz w:val="18"/>
+              </w:rPr>
+              <w:t>3</w:t>
+            </w:r>
+          </w:p>
+        </w:tc>
+      </w:tr>
+      <w:tr>
+        <w:tc>
+          <w:tcPr>
+            <w:tcW w:type="dxa" w:w="2880"/>
+          </w:tcPr>
+          <w:p>
+            <w:r/>
+            <w:r>
+              <w:rPr>
+                <w:sz w:val="18"/>
+              </w:rPr>
+              <w:t>Confidence threshold (ε)</w:t>
+            </w:r>
+          </w:p>
+        </w:tc>
+        <w:tc>
+          <w:tcPr>
+            <w:tcW w:type="dxa" w:w="2880"/>
+          </w:tcPr>
+          <w:p>
+            <w:r/>
+            <w:r>
+              <w:rPr>
+                <w:sz w:val="18"/>
+              </w:rPr>
+              <w:t>0.183</w:t>
+            </w:r>
+          </w:p>
+        </w:tc>
+        <w:tc>
+          <w:tcPr>
+            <w:tcW w:type="dxa" w:w="2880"/>
+          </w:tcPr>
+          <w:p>
+            <w:r/>
+            <w:r>
+              <w:rPr>
+                <w:sz w:val="18"/>
+              </w:rPr>
+              <w:t>4</w:t>
+            </w:r>
+          </w:p>
+        </w:tc>
+      </w:tr>
+      <w:tr>
+        <w:tc>
+          <w:tcPr>
+            <w:tcW w:type="dxa" w:w="2880"/>
+          </w:tcPr>
+          <w:p>
+            <w:r/>
+            <w:r>
+              <w:rPr>
+                <w:sz w:val="18"/>
+              </w:rPr>
+              <w:t>Noise (σ)</w:t>
+            </w:r>
+          </w:p>
+        </w:tc>
+        <w:tc>
+          <w:tcPr>
+            <w:tcW w:type="dxa" w:w="2880"/>
+          </w:tcPr>
+          <w:p>
+            <w:r/>
+            <w:r>
+              <w:rPr>
+                <w:sz w:val="18"/>
+              </w:rPr>
+              <w:t>0.128</w:t>
+            </w:r>
+          </w:p>
+        </w:tc>
+        <w:tc>
+          <w:tcPr>
+            <w:tcW w:type="dxa" w:w="2880"/>
+          </w:tcPr>
+          <w:p>
+            <w:r/>
+            <w:r>
+              <w:rPr>
+                <w:sz w:val="18"/>
+              </w:rPr>
+              <w:t>5</w:t>
+            </w:r>
+          </w:p>
+        </w:tc>
+      </w:tr>
+      <w:tr>
+        <w:tc>
+          <w:tcPr>
+            <w:tcW w:type="dxa" w:w="2880"/>
+          </w:tcPr>
+          <w:p>
+            <w:r/>
+            <w:r>
+              <w:rPr>
+                <w:sz w:val="18"/>
+              </w:rPr>
+              <w:t>Peer trust multiplier</w:t>
+            </w:r>
+          </w:p>
+        </w:tc>
+        <w:tc>
+          <w:tcPr>
+            <w:tcW w:type="dxa" w:w="2880"/>
+          </w:tcPr>
+          <w:p>
+            <w:r/>
+            <w:r>
+              <w:rPr>
+                <w:sz w:val="18"/>
+              </w:rPr>
+              <w:t>0.015</w:t>
+            </w:r>
+          </w:p>
+        </w:tc>
+        <w:tc>
+          <w:tcPr>
+            <w:tcW w:type="dxa" w:w="2880"/>
+          </w:tcPr>
+          <w:p>
+            <w:r/>
+            <w:r>
+              <w:rPr>
+                <w:sz w:val="18"/>
+              </w:rPr>
+              <w:t>6 (least influential)</w:t>
+            </w:r>
+          </w:p>
+        </w:tc>
+      </w:tr>
+    </w:tbl>
+    <w:p/>
+    <w:p>
+      <w:pPr>
+        <w:spacing w:after="120"/>
+      </w:pPr>
+      <w:r>
+        <w:rPr>
+          <w:b w:val="0"/>
+          <w:i w:val="0"/>
+          <w:sz w:val="22"/>
+        </w:rPr>
+        <w:t>Interpretation: the model is most sensitive to the expert and influencer pull coefficients — these are the true levers that decide between consensus and polarization. The bounded-confidence threshold ε has a clear but secondary effect (it gates whether opinions can reach each other). The peer-trust multiplier alone has little effect, confirming that structure (experts vs influencers) matters more than peer trust magnitude.</w:t>
+      </w:r>
+    </w:p>
+    <w:p>
+      <w:pPr>
+        <w:jc w:val="center"/>
+      </w:pPr>
+      <w:r>
+        <w:drawing>
+          <wp:inline xmlns:a="http://schemas.openxmlformats.org/drawingml/2006/main" xmlns:pic="http://schemas.openxmlformats.org/drawingml/2006/picture">
+            <wp:extent cx="5669280" cy="3023616"/>
+            <wp:docPr id="7" name="Picture 7"/>
+            <wp:cNvGraphicFramePr>
+              <a:graphicFrameLocks noChangeAspect="1"/>
+            </wp:cNvGraphicFramePr>
+            <a:graphic>
+              <a:graphicData uri="http://schemas.openxmlformats.org/drawingml/2006/picture">
+                <pic:pic>
+                  <pic:nvPicPr>
+                    <pic:cNvPr id="0" name="fig_sensitivity.png"/>
+                    <pic:cNvPicPr/>
+                  </pic:nvPicPr>
+                  <pic:blipFill>
+                    <a:blip r:embed="rId15"/>
+                    <a:stretch>
+                      <a:fillRect/>
+                    </a:stretch>
+                  </pic:blipFill>
+                  <pic:spPr>
+                    <a:xfrm>
+                      <a:off x="0" y="0"/>
+                      <a:ext cx="5669280" cy="3023616"/>
+                    </a:xfrm>
+                    <a:prstGeom prst="rect"/>
+                  </pic:spPr>
+                </pic:pic>
+              </a:graphicData>
+            </a:graphic>
+          </wp:inline>
+        </w:drawing>
+      </w:r>
+    </w:p>
+    <w:p>
+      <w:pPr>
+        <w:spacing w:after="200"/>
+        <w:jc w:val="center"/>
+      </w:pPr>
+      <w:r>
+        <w:rPr>
+          <w:i/>
+          <w:sz w:val="18"/>
+        </w:rPr>
+        <w:t>Figure B — One-at-a-time parameter sweeps vs final opinion spread.</w:t>
+      </w:r>
+    </w:p>
+    <w:p>
+      <w:pPr>
+        <w:jc w:val="center"/>
+      </w:pPr>
+      <w:r>
+        <w:drawing>
+          <wp:inline xmlns:a="http://schemas.openxmlformats.org/drawingml/2006/main" xmlns:pic="http://schemas.openxmlformats.org/drawingml/2006/picture">
+            <wp:extent cx="4937760" cy="2468880"/>
+            <wp:docPr id="8" name="Picture 8"/>
+            <wp:cNvGraphicFramePr>
+              <a:graphicFrameLocks noChangeAspect="1"/>
+            </wp:cNvGraphicFramePr>
+            <a:graphic>
+              <a:graphicData uri="http://schemas.openxmlformats.org/drawingml/2006/picture">
+                <pic:pic>
+                  <pic:nvPicPr>
+                    <pic:cNvPr id="0" name="fig_tornado.png"/>
+                    <pic:cNvPicPr/>
+                  </pic:nvPicPr>
+                  <pic:blipFill>
+                    <a:blip r:embed="rId16"/>
+                    <a:stretch>
+                      <a:fillRect/>
+                    </a:stretch>
+                  </pic:blipFill>
+                  <pic:spPr>
+                    <a:xfrm>
+                      <a:off x="0" y="0"/>
+                      <a:ext cx="4937760" cy="2468880"/>
+                    </a:xfrm>
+                    <a:prstGeom prst="rect"/>
+                  </pic:spPr>
+                </pic:pic>
+              </a:graphicData>
+            </a:graphic>
+          </wp:inline>
+        </w:drawing>
+      </w:r>
+    </w:p>
+    <w:p>
+      <w:pPr>
+        <w:spacing w:after="200"/>
+        <w:jc w:val="center"/>
+      </w:pPr>
+      <w:r>
+        <w:rPr>
+          <w:i/>
+          <w:sz w:val="18"/>
+        </w:rPr>
+        <w:t>Figure C — Tornado chart ranking parameter influence on final spread.</w:t>
+      </w:r>
+    </w:p>
+    <w:p>
+      <w:pPr>
+        <w:pStyle w:val="Heading2"/>
+      </w:pPr>
+      <w:r>
+        <w:rPr>
+          <w:color w:val="1F3A5F"/>
+        </w:rPr>
+        <w:t>3.3 Statistical Evaluation</w:t>
+      </w:r>
+    </w:p>
+    <w:p>
+      <w:pPr>
+        <w:spacing w:after="120"/>
+      </w:pPr>
+      <w:r>
+        <w:rPr>
+          <w:b w:val="0"/>
+          <w:i w:val="0"/>
+          <w:sz w:val="22"/>
+        </w:rPr>
+        <w:t>Each scenario was run with 40 independent random seeds. Below are the mean final spread with 95% bootstrap confidence intervals, an ANOVA across scenarios, and effect sizes versus the baseline.</w:t>
+      </w:r>
+    </w:p>
+    <w:tbl>
+      <w:tblPr>
+        <w:tblStyle w:val="LightGrid-Accent1"/>
+        <w:tblW w:type="auto" w:w="0"/>
+        <w:tblLook w:firstColumn="1" w:firstRow="1" w:lastColumn="0" w:lastRow="0" w:noHBand="0" w:noVBand="1" w:val="04A0"/>
+      </w:tblPr>
+      <w:tblGrid>
+        <w:gridCol w:w="2160"/>
+        <w:gridCol w:w="2160"/>
+        <w:gridCol w:w="2160"/>
+        <w:gridCol w:w="2160"/>
+      </w:tblGrid>
+      <w:tr>
+        <w:tc>
+          <w:tcPr>
+            <w:tcW w:type="dxa" w:w="2160"/>
+          </w:tcPr>
+          <w:p>
+            <w:r/>
+            <w:r>
+              <w:rPr>
+                <w:b/>
+                <w:sz w:val="18"/>
+              </w:rPr>
+              <w:t>Scenario</w:t>
+            </w:r>
+          </w:p>
+        </w:tc>
+        <w:tc>
+          <w:tcPr>
+            <w:tcW w:type="dxa" w:w="2160"/>
+          </w:tcPr>
+          <w:p>
+            <w:r/>
+            <w:r>
+              <w:rPr>
+                <w:b/>
+                <w:sz w:val="18"/>
+              </w:rPr>
+              <w:t>Mean spread (std)</w:t>
+            </w:r>
+          </w:p>
+        </w:tc>
+        <w:tc>
+          <w:tcPr>
+            <w:tcW w:type="dxa" w:w="2160"/>
+          </w:tcPr>
+          <w:p>
+            <w:r/>
+            <w:r>
+              <w:rPr>
+                <w:b/>
+                <w:sz w:val="18"/>
+              </w:rPr>
+              <w:t>95% CI</w:t>
+            </w:r>
+          </w:p>
+        </w:tc>
+        <w:tc>
+          <w:tcPr>
+            <w:tcW w:type="dxa" w:w="2160"/>
+          </w:tcPr>
+          <w:p>
+            <w:r/>
+            <w:r>
+              <w:rPr>
+                <w:b/>
+                <w:sz w:val="18"/>
+              </w:rPr>
+              <w:t>Mean opinion</w:t>
+            </w:r>
+          </w:p>
+        </w:tc>
+      </w:tr>
+      <w:tr>
+        <w:tc>
+          <w:tcPr>
+            <w:tcW w:type="dxa" w:w="2160"/>
+          </w:tcPr>
+          <w:p>
+            <w:r/>
+            <w:r>
+              <w:rPr>
+                <w:sz w:val="18"/>
+              </w:rPr>
+              <w:t>S1 Baseline</w:t>
+            </w:r>
+          </w:p>
+        </w:tc>
+        <w:tc>
+          <w:tcPr>
+            <w:tcW w:type="dxa" w:w="2160"/>
+          </w:tcPr>
+          <w:p>
+            <w:r/>
+            <w:r>
+              <w:rPr>
+                <w:sz w:val="18"/>
+              </w:rPr>
+              <w:t>0.063</w:t>
+            </w:r>
+          </w:p>
+        </w:tc>
+        <w:tc>
+          <w:tcPr>
+            <w:tcW w:type="dxa" w:w="2160"/>
+          </w:tcPr>
+          <w:p>
+            <w:r/>
+            <w:r>
+              <w:rPr>
+                <w:sz w:val="18"/>
+              </w:rPr>
+              <w:t>[0.051, 0.077]</w:t>
+            </w:r>
+          </w:p>
+        </w:tc>
+        <w:tc>
+          <w:tcPr>
+            <w:tcW w:type="dxa" w:w="2160"/>
+          </w:tcPr>
+          <w:p>
+            <w:r/>
+            <w:r>
+              <w:rPr>
+                <w:sz w:val="18"/>
+              </w:rPr>
+              <w:t>+0.005</w:t>
+            </w:r>
+          </w:p>
+        </w:tc>
+      </w:tr>
+      <w:tr>
+        <w:tc>
+          <w:tcPr>
+            <w:tcW w:type="dxa" w:w="2160"/>
+          </w:tcPr>
+          <w:p>
+            <w:r/>
+            <w:r>
+              <w:rPr>
+                <w:sz w:val="18"/>
+              </w:rPr>
+              <w:t>S2 Strong Influencer</w:t>
+            </w:r>
+          </w:p>
+        </w:tc>
+        <w:tc>
+          <w:tcPr>
+            <w:tcW w:type="dxa" w:w="2160"/>
+          </w:tcPr>
+          <w:p>
+            <w:r/>
+            <w:r>
+              <w:rPr>
+                <w:sz w:val="18"/>
+              </w:rPr>
+              <w:t>0.644</w:t>
+            </w:r>
+          </w:p>
+        </w:tc>
+        <w:tc>
+          <w:tcPr>
+            <w:tcW w:type="dxa" w:w="2160"/>
+          </w:tcPr>
+          <w:p>
+            <w:r/>
+            <w:r>
+              <w:rPr>
+                <w:sz w:val="18"/>
+              </w:rPr>
+              <w:t>[0.629, 0.659]</w:t>
+            </w:r>
+          </w:p>
+        </w:tc>
+        <w:tc>
+          <w:tcPr>
+            <w:tcW w:type="dxa" w:w="2160"/>
+          </w:tcPr>
+          <w:p>
+            <w:r/>
+            <w:r>
+              <w:rPr>
+                <w:sz w:val="18"/>
+              </w:rPr>
+              <w:t>−0.000</w:t>
+            </w:r>
+          </w:p>
+        </w:tc>
+      </w:tr>
+      <w:tr>
+        <w:tc>
+          <w:tcPr>
+            <w:tcW w:type="dxa" w:w="2160"/>
+          </w:tcPr>
+          <w:p>
+            <w:r/>
+            <w:r>
+              <w:rPr>
+                <w:sz w:val="18"/>
+              </w:rPr>
+              <w:t>S3 Strong Expert</w:t>
+            </w:r>
+          </w:p>
+        </w:tc>
+        <w:tc>
+          <w:tcPr>
+            <w:tcW w:type="dxa" w:w="2160"/>
+          </w:tcPr>
+          <w:p>
+            <w:r/>
+            <w:r>
+              <w:rPr>
+                <w:sz w:val="18"/>
+              </w:rPr>
+              <w:t>0.059</w:t>
+            </w:r>
+          </w:p>
+        </w:tc>
+        <w:tc>
+          <w:tcPr>
+            <w:tcW w:type="dxa" w:w="2160"/>
+          </w:tcPr>
+          <w:p>
+            <w:r/>
+            <w:r>
+              <w:rPr>
+                <w:sz w:val="18"/>
+              </w:rPr>
+              <w:t>[0.049, 0.070]</w:t>
+            </w:r>
+          </w:p>
+        </w:tc>
+        <w:tc>
+          <w:tcPr>
+            <w:tcW w:type="dxa" w:w="2160"/>
+          </w:tcPr>
+          <w:p>
+            <w:r/>
+            <w:r>
+              <w:rPr>
+                <w:sz w:val="18"/>
+              </w:rPr>
+              <w:t>−0.001</w:t>
+            </w:r>
+          </w:p>
+        </w:tc>
+      </w:tr>
+      <w:tr>
+        <w:tc>
+          <w:tcPr>
+            <w:tcW w:type="dxa" w:w="2160"/>
+          </w:tcPr>
+          <w:p>
+            <w:r/>
+            <w:r>
+              <w:rPr>
+                <w:sz w:val="18"/>
+              </w:rPr>
+              <w:t>S4 Low Trust</w:t>
+            </w:r>
+          </w:p>
+        </w:tc>
+        <w:tc>
+          <w:tcPr>
+            <w:tcW w:type="dxa" w:w="2160"/>
+          </w:tcPr>
+          <w:p>
+            <w:r/>
+            <w:r>
+              <w:rPr>
+                <w:sz w:val="18"/>
+              </w:rPr>
+              <w:t>0.299</w:t>
+            </w:r>
+          </w:p>
+        </w:tc>
+        <w:tc>
+          <w:tcPr>
+            <w:tcW w:type="dxa" w:w="2160"/>
+          </w:tcPr>
+          <w:p>
+            <w:r/>
+            <w:r>
+              <w:rPr>
+                <w:sz w:val="18"/>
+              </w:rPr>
+              <w:t>[0.291, 0.307]</w:t>
+            </w:r>
+          </w:p>
+        </w:tc>
+        <w:tc>
+          <w:tcPr>
+            <w:tcW w:type="dxa" w:w="2160"/>
+          </w:tcPr>
+          <w:p>
+            <w:r/>
+            <w:r>
+              <w:rPr>
+                <w:sz w:val="18"/>
+              </w:rPr>
+              <w:t>+0.003</w:t>
+            </w:r>
+          </w:p>
+        </w:tc>
+      </w:tr>
+    </w:tbl>
+    <w:p/>
+    <w:p>
+      <w:pPr>
+        <w:pStyle w:val="ListBullet"/>
+      </w:pPr>
+      <w:r>
+        <w:rPr>
+          <w:b/>
+        </w:rPr>
+        <w:t xml:space="preserve">One-way ANOVA (final spread across the 4 scenarios): </w:t>
+      </w:r>
+      <w:r>
+        <w:t>F = 1991.24, permutation p = 0.0002 — the scenarios are statistically highly different (the parameter choices genuinely drive the outcomes).</w:t>
+      </w:r>
+    </w:p>
+    <w:p>
+      <w:pPr>
+        <w:pStyle w:val="ListBullet"/>
+      </w:pPr>
+      <w:r>
+        <w:rPr>
+          <w:b/>
+        </w:rPr>
+        <w:t xml:space="preserve">Effect size vs baseline (Cohen’s d): </w:t>
+      </w:r>
+      <w:r>
+        <w:t>S2 d = +12.68 (very large, p = 0.0002); S4 d = +6.72 (very large, p = 0.0002); S3 d = −0.11 (negligible, p = 0.63 — statistically indistinguishable from baseline, as expected since both reach consensus).</w:t>
+      </w:r>
+    </w:p>
+    <w:p>
+      <w:pPr>
+        <w:pStyle w:val="ListBullet"/>
+      </w:pPr>
+      <w:r>
+        <w:rPr>
+          <w:b/>
+        </w:rPr>
+        <w:t xml:space="preserve">Mean final opinion ≈ 0 in every scenario: </w:t>
+      </w:r>
+      <w:r>
+        <w:t>the model is unbiased — polarization in S2 is symmetric (pro and anti camps of similar size), not a drift toward one side.</w:t>
+      </w:r>
+    </w:p>
+    <w:p>
+      <w:pPr>
+        <w:jc w:val="center"/>
+      </w:pPr>
+      <w:r>
+        <w:drawing>
+          <wp:inline xmlns:a="http://schemas.openxmlformats.org/drawingml/2006/main" xmlns:pic="http://schemas.openxmlformats.org/drawingml/2006/picture">
+            <wp:extent cx="5120640" cy="2844800"/>
+            <wp:docPr id="9" name="Picture 9"/>
+            <wp:cNvGraphicFramePr>
+              <a:graphicFrameLocks noChangeAspect="1"/>
+            </wp:cNvGraphicFramePr>
+            <a:graphic>
+              <a:graphicData uri="http://schemas.openxmlformats.org/drawingml/2006/picture">
+                <pic:pic>
+                  <pic:nvPicPr>
+                    <pic:cNvPr id="0" name="fig_statistics.png"/>
+                    <pic:cNvPicPr/>
+                  </pic:nvPicPr>
+                  <pic:blipFill>
+                    <a:blip r:embed="rId17"/>
+                    <a:stretch>
+                      <a:fillRect/>
+                    </a:stretch>
+                  </pic:blipFill>
+                  <pic:spPr>
+                    <a:xfrm>
+                      <a:off x="0" y="0"/>
+                      <a:ext cx="5120640" cy="2844800"/>
+                    </a:xfrm>
+                    <a:prstGeom prst="rect"/>
+                  </pic:spPr>
+                </pic:pic>
+              </a:graphicData>
+            </a:graphic>
+          </wp:inline>
+        </w:drawing>
+      </w:r>
+    </w:p>
+    <w:p>
+      <w:pPr>
+        <w:spacing w:after="200"/>
+        <w:jc w:val="center"/>
+      </w:pPr>
+      <w:r>
+        <w:rPr>
+          <w:i/>
+          <w:sz w:val="18"/>
+        </w:rPr>
+        <w:t>Figure D — Distribution of final opinion spread across 40 seeds per scenario (box = IQR, line = median, triangle = mean).</w:t>
+      </w:r>
+    </w:p>
+    <w:p>
+      <w:pPr>
+        <w:pStyle w:val="Heading2"/>
+      </w:pPr>
+      <w:r>
+        <w:rPr>
+          <w:color w:val="1F3A5F"/>
+        </w:rPr>
+        <w:t>3.4 Summary of Findings</w:t>
+      </w:r>
+    </w:p>
+    <w:p>
+      <w:pPr>
+        <w:pStyle w:val="ListBullet"/>
+      </w:pPr>
+      <w:r>
+        <w:rPr>
+          <w:b/>
+        </w:rPr>
+        <w:t xml:space="preserve">Validity: </w:t>
+      </w:r>
+      <w:r>
+        <w:t>the four scenarios are statistically distinct (ANOVA p = 0.0002) and reproducible across seeds.</w:t>
+      </w:r>
+    </w:p>
+    <w:p>
+      <w:pPr>
+        <w:pStyle w:val="ListBullet"/>
+      </w:pPr>
+      <w:r>
+        <w:rPr>
+          <w:b/>
+        </w:rPr>
+        <w:t xml:space="preserve">Stability: </w:t>
+      </w:r>
+      <w:r>
+        <w:t>baseline and expert-driven regimes are robust; influencer and low-trust regimes are sensitive to initial conditions — consistent with real polarized/echo-chamber societies.</w:t>
+      </w:r>
+    </w:p>
+    <w:p>
+      <w:pPr>
+        <w:pStyle w:val="ListBullet"/>
+      </w:pPr>
+      <w:r>
+        <w:rPr>
+          <w:b/>
+        </w:rPr>
+        <w:t xml:space="preserve">Key drivers: </w:t>
+      </w:r>
+      <w:r>
+        <w:t>expert credibility (γ) and influencer reach (δ) are the dominant parameters; peer-trust magnitude is negligible by comparison.</w:t>
+      </w:r>
+    </w:p>
+    <w:p>
+      <w:pPr>
+        <w:pStyle w:val="ListBullet"/>
+      </w:pPr>
+      <w:r>
+        <w:rPr>
+          <w:b/>
+        </w:rPr>
+        <w:t xml:space="preserve">Practical implication for MoE: </w:t>
+      </w:r>
+      <w:r>
+        <w:t>to keep public opinion on AI learning assistants healthy and consensual, investing in credible expert communication is far more effective than countering individual peer chatter, and maintaining public trust prevents fragmentation into echo chambers.</w:t>
+      </w:r>
+    </w:p>
     <w:sectPr>
       <w:pgSz w:w="12240" w:h="15840"/>
       <w:pgMar w:top="1440" w:right="1800" w:bottom="1440" w:left="1800" w:header="720" w:footer="720" w:gutter="0"/>

</xml_diff>